<commit_message>
Cleaned redundant files, Now ready for first attempt at porting to shiny.io
</commit_message>
<xml_diff>
--- a/Docs/Documentation - temp.docx
+++ b/Docs/Documentation - temp.docx
@@ -18,6 +18,7 @@
     <w:p>
       <w:pPr>
         <w:rPr>
+          <w:rtl/>
           <w:lang w:val="en-US"/>
         </w:rPr>
       </w:pPr>
@@ -114,6 +115,240 @@
           <w:lang w:val="en-US"/>
         </w:rPr>
       </w:pPr>
+      <w:r>
+        <w:rPr>
+          <w:lang w:val="en-US"/>
+        </w:rPr>
+        <w:t xml:space="preserve">However Covert et. Al used different reference values than the ones used by us, while we used the median of toxicity tests in the ecotox database for each pollutant and taxonomic group, </w:t>
+      </w:r>
+      <w:r>
+        <w:rPr>
+          <w:lang w:val="en-US"/>
+        </w:rPr>
+        <w:t xml:space="preserve">while </w:t>
+      </w:r>
+      <w:r>
+        <w:rPr>
+          <w:lang w:val="en-US"/>
+        </w:rPr>
+        <w:fldChar w:fldCharType="begin" w:fldLock="1"/>
+      </w:r>
+      <w:r>
+        <w:rPr>
+          <w:lang w:val="en-US"/>
+        </w:rPr>
+        <w:instrText>ADDIN paperpile_citation &lt;clusterId&gt;D998K956G446D139&lt;/clusterId&gt;&lt;metadata&gt;&lt;citation&gt;&lt;id&gt;8a70970a-08e7-0058-a25b-b110be63c511&lt;/id&gt;&lt;/citation&gt;&lt;/metadata&gt;&lt;data&gt;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&lt;/data&gt; \* MERGEFORMAT</w:instrText>
+      </w:r>
+      <w:r>
+        <w:rPr>
+          <w:lang w:val="en-US"/>
+        </w:rPr>
+        <w:fldChar w:fldCharType="separate"/>
+      </w:r>
+      <w:r>
+        <w:rPr>
+          <w:noProof/>
+          <w:lang w:val="en-US"/>
+        </w:rPr>
+        <w:t xml:space="preserve">Covert et al. </w:t>
+      </w:r>
+      <w:r>
+        <w:rPr>
+          <w:noProof/>
+          <w:lang w:val="en-US"/>
+        </w:rPr>
+        <w:t>(</w:t>
+      </w:r>
+      <w:r>
+        <w:rPr>
+          <w:noProof/>
+          <w:lang w:val="en-US"/>
+        </w:rPr>
+        <w:t>2020)</w:t>
+      </w:r>
+      <w:r>
+        <w:rPr>
+          <w:lang w:val="en-US"/>
+        </w:rPr>
+        <w:fldChar w:fldCharType="end"/>
+      </w:r>
+      <w:r>
+        <w:rPr>
+          <w:lang w:val="en-US"/>
+        </w:rPr>
+        <w:t xml:space="preserve"> used the “a</w:t>
+      </w:r>
+      <w:r>
+        <w:rPr>
+          <w:lang w:val="en-US"/>
+        </w:rPr>
+        <w:t xml:space="preserve">quatic </w:t>
+      </w:r>
+      <w:r>
+        <w:rPr>
+          <w:lang w:val="en-US"/>
+        </w:rPr>
+        <w:t>l</w:t>
+      </w:r>
+      <w:r>
+        <w:rPr>
+          <w:lang w:val="en-US"/>
+        </w:rPr>
+        <w:t xml:space="preserve">ife </w:t>
+      </w:r>
+      <w:r>
+        <w:rPr>
+          <w:lang w:val="en-US"/>
+        </w:rPr>
+        <w:t>b</w:t>
+      </w:r>
+      <w:r>
+        <w:rPr>
+          <w:lang w:val="en-US"/>
+        </w:rPr>
+        <w:t xml:space="preserve">enchmarks and </w:t>
+      </w:r>
+      <w:r>
+        <w:rPr>
+          <w:lang w:val="en-US"/>
+        </w:rPr>
+        <w:t>e</w:t>
+      </w:r>
+      <w:r>
+        <w:rPr>
+          <w:lang w:val="en-US"/>
+        </w:rPr>
+        <w:t xml:space="preserve">cological </w:t>
+      </w:r>
+      <w:r>
+        <w:rPr>
+          <w:lang w:val="en-US"/>
+        </w:rPr>
+        <w:t>r</w:t>
+      </w:r>
+      <w:r>
+        <w:rPr>
+          <w:lang w:val="en-US"/>
+        </w:rPr>
+        <w:t xml:space="preserve">isk </w:t>
+      </w:r>
+      <w:r>
+        <w:rPr>
+          <w:lang w:val="en-US"/>
+        </w:rPr>
+        <w:t>a</w:t>
+      </w:r>
+      <w:r>
+        <w:rPr>
+          <w:lang w:val="en-US"/>
+        </w:rPr>
+        <w:t xml:space="preserve">ssessments for </w:t>
+      </w:r>
+      <w:r>
+        <w:rPr>
+          <w:lang w:val="en-US"/>
+        </w:rPr>
+        <w:t>r</w:t>
+      </w:r>
+      <w:r>
+        <w:rPr>
+          <w:lang w:val="en-US"/>
+        </w:rPr>
+        <w:t xml:space="preserve">egistered </w:t>
+      </w:r>
+      <w:r>
+        <w:rPr>
+          <w:lang w:val="en-US"/>
+        </w:rPr>
+        <w:t>p</w:t>
+      </w:r>
+      <w:r>
+        <w:rPr>
+          <w:lang w:val="en-US"/>
+        </w:rPr>
+        <w:t>esticides</w:t>
+      </w:r>
+      <w:r>
+        <w:rPr>
+          <w:lang w:val="en-US"/>
+        </w:rPr>
+        <w:t xml:space="preserve"> </w:t>
+      </w:r>
+      <w:r>
+        <w:rPr>
+          <w:lang w:val="en-US"/>
+        </w:rPr>
+        <w:fldChar w:fldCharType="begin" w:fldLock="1"/>
+      </w:r>
+      <w:r>
+        <w:rPr>
+          <w:lang w:val="en-US"/>
+        </w:rPr>
+        <w:instrText>ADDIN paperpile_citation &lt;clusterId&gt;Z751N811J291G812&lt;/clusterId&gt;&lt;metadata&gt;&lt;citation&gt;&lt;id&gt;a1fe7446-1905-4f55-9b80-e2c61f6f8520&lt;/id&gt;&lt;/citation&gt;&lt;/metadata&gt;&lt;data&gt;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&lt;/data&gt; \* MERGEFORMAT</w:instrText>
+      </w:r>
+      <w:r>
+        <w:rPr>
+          <w:lang w:val="en-US"/>
+        </w:rPr>
+        <w:fldChar w:fldCharType="separate"/>
+      </w:r>
+      <w:r>
+        <w:rPr>
+          <w:noProof/>
+          <w:lang w:val="en-US"/>
+        </w:rPr>
+        <w:t>(US-EPA 2026)</w:t>
+      </w:r>
+      <w:r>
+        <w:rPr>
+          <w:lang w:val="en-US"/>
+        </w:rPr>
+        <w:fldChar w:fldCharType="end"/>
+      </w:r>
+      <w:r>
+        <w:rPr>
+          <w:lang w:val="en-US"/>
+        </w:rPr>
+        <w:t xml:space="preserve"> In order to compare the two we created a separate script that build</w:t>
+      </w:r>
+      <w:r>
+        <w:rPr>
+          <w:lang w:val="en-US"/>
+        </w:rPr>
+        <w:t>s</w:t>
+      </w:r>
+      <w:r>
+        <w:rPr>
+          <w:lang w:val="en-US"/>
+        </w:rPr>
+        <w:t xml:space="preserve"> </w:t>
+      </w:r>
+      <w:r>
+        <w:rPr>
+          <w:lang w:val="en-US"/>
+        </w:rPr>
+        <w:t xml:space="preserve">a reference toxicity that is the input of our app from the same aquatic life benchmark Covert et. Al. (2020) used. This way we validated the functioning of our application. Additionally, we manually tested the calculation of 20 pollutant/taxon combination to make sure these are performed correctly. </w:t>
+      </w:r>
+    </w:p>
+    <w:p>
+      <w:pPr>
+        <w:rPr>
+          <w:lang w:val="en-US"/>
+        </w:rPr>
+      </w:pPr>
+      <w:r>
+        <w:rPr>
+          <w:lang w:val="en-US"/>
+        </w:rPr>
+        <w:t>Keep a reference to DSSTOX and describe a method of CAS_aquisition</w:t>
+      </w:r>
+    </w:p>
+    <w:p>
+      <w:pPr>
+        <w:rPr>
+          <w:lang w:val="en-US"/>
+        </w:rPr>
+      </w:pPr>
     </w:p>
     <w:p>
       <w:pPr>
@@ -127,6 +362,7 @@
         <w:spacing w:after="0" w:line="240" w:lineRule="auto"/>
         <w:ind w:left="720" w:hanging="720"/>
         <w:rPr>
+          <w:noProof/>
           <w:lang w:val="en-US"/>
         </w:rPr>
       </w:pPr>
@@ -169,6 +405,22 @@
           <w:lang w:val="en-US"/>
         </w:rPr>
         <w:t xml:space="preserve"> 745 (141285): 141285.</w:t>
+      </w:r>
+    </w:p>
+    <w:p>
+      <w:pPr>
+        <w:spacing w:after="0" w:line="240" w:lineRule="auto"/>
+        <w:ind w:left="720" w:hanging="720"/>
+        <w:rPr>
+          <w:lang w:val="en-US"/>
+        </w:rPr>
+      </w:pPr>
+      <w:r>
+        <w:rPr>
+          <w:noProof/>
+          <w:lang w:val="en-US"/>
+        </w:rPr>
+        <w:t>US-EPA. 2026. “Aquatic Life Benchmarks and Ecological Risk Assessments for Registered Pesticides.” US EPA. 2026. https://www.epa.gov/pesticide-science-and-assessing-pesticide-risks/aquatic-life-benchmarks-and-ecological-risk.</w:t>
       </w:r>
       <w:r>
         <w:rPr>
@@ -790,6 +1042,7 @@
   <w:style w:type="character" w:default="1" w:styleId="a0">
     <w:name w:val="Default Paragraph Font"/>
     <w:uiPriority w:val="1"/>
+    <w:semiHidden/>
     <w:unhideWhenUsed/>
   </w:style>
   <w:style w:type="table" w:default="1" w:styleId="a1">

</xml_diff>